<commit_message>
Update BRD/output docs and notebook run
</commit_message>
<xml_diff>
--- a/docs/SWIFT_Address_Town_Country_BRD_Enterprise_v2.docx
+++ b/docs/SWIFT_Address_Town_Country_BRD_Enterprise_v2.docx
@@ -1118,16 +1118,7 @@
         <w:pStyle w:val="Heading2"/>
       </w:pPr>
       <w:r>
-        <w:t>3</w:t>
-      </w:r>
-      <w:r>
-        <w:t>.</w:t>
-      </w:r>
-      <w:r>
-        <w:t>3</w:t>
-      </w:r>
-      <w:r>
-        <w:t xml:space="preserve"> Business Outcomes</w:t>
+        <w:t>3.3 Business Outcomes</w:t>
       </w:r>
     </w:p>
     <w:p>
@@ -1809,13 +1800,7 @@
         <w:pStyle w:val="Heading2"/>
       </w:pPr>
       <w:r>
-        <w:t>4.</w:t>
-      </w:r>
-      <w:r>
-        <w:t>2.</w:t>
-      </w:r>
-      <w:r>
-        <w:t xml:space="preserve"> Stakeholders and Roles</w:t>
+        <w:t>4.2. Stakeholders and Roles</w:t>
       </w:r>
     </w:p>
     <w:tbl>
@@ -3721,13 +3706,7 @@
         <w:pStyle w:val="Heading2"/>
       </w:pPr>
       <w:r>
-        <w:t>5.</w:t>
-      </w:r>
-      <w:r>
-        <w:t>4</w:t>
-      </w:r>
-      <w:r>
-        <w:t xml:space="preserve"> Logical Processing Flow</w:t>
+        <w:t>5.4 Logical Processing Flow</w:t>
       </w:r>
     </w:p>
     <w:p>
@@ -10740,10 +10719,7 @@
         <w:pStyle w:val="Heading1"/>
       </w:pPr>
       <w:r>
-        <w:t>9</w:t>
-      </w:r>
-      <w:r>
-        <w:t>. Cross-Entropy - Model Confidence Evaluation</w:t>
+        <w:t>9. Cross-Entropy - Model Confidence Evaluation</w:t>
       </w:r>
     </w:p>
     <w:p>
@@ -11220,10 +11196,7 @@
         <w:pStyle w:val="Heading1"/>
       </w:pPr>
       <w:r>
-        <w:t>10</w:t>
-      </w:r>
-      <w:r>
-        <w:t>. Human-in-the-Loop Strategy</w:t>
+        <w:t>10. Human-in-the-Loop Strategy</w:t>
       </w:r>
     </w:p>
     <w:p>
@@ -11231,10 +11204,7 @@
         <w:pStyle w:val="Heading2"/>
       </w:pPr>
       <w:r>
-        <w:t>10</w:t>
-      </w:r>
-      <w:r>
-        <w:t>.1 Phase 1 - Routing Recommendation Only</w:t>
+        <w:t>10.1 Phase 1 - Routing Recommendation Only</w:t>
       </w:r>
     </w:p>
     <w:p>
@@ -11252,10 +11222,7 @@
         <w:pStyle w:val="Heading2"/>
       </w:pPr>
       <w:r>
-        <w:t>10</w:t>
-      </w:r>
-      <w:r>
-        <w:t>.2 Phase 2 - Dedicated HITL Capability</w:t>
+        <w:t>10.2 Phase 2 - Dedicated HITL Capability</w:t>
       </w:r>
     </w:p>
     <w:tbl>
@@ -11461,13 +11428,7 @@
         <w:pStyle w:val="Heading2"/>
       </w:pPr>
       <w:r>
-        <w:t>11.</w:t>
-      </w:r>
-      <w:r>
-        <w:t>1</w:t>
-      </w:r>
-      <w:r>
-        <w:t xml:space="preserve"> Required Audit Metadata</w:t>
+        <w:t>11.1 Required Audit Metadata</w:t>
       </w:r>
     </w:p>
     <w:tbl>
@@ -15568,9 +15529,6 @@
           <w:p>
             <w:pPr>
               <w:jc w:val="center"/>
-              <w:rPr>
-                <w:lang w:val="it-IT"/>
-              </w:rPr>
             </w:pPr>
             <w:r>
               <w:rPr>
@@ -15583,7 +15541,6 @@
               <w:rPr>
                 <w:rFonts w:ascii="Consolas" w:hAnsi="Consolas"/>
                 <w:sz w:val="18"/>
-                <w:lang w:val="it-IT"/>
               </w:rPr>
               <w:t>|</w:t>
             </w:r>
@@ -15591,15 +15548,11 @@
           <w:p>
             <w:pPr>
               <w:jc w:val="center"/>
-              <w:rPr>
-                <w:lang w:val="it-IT"/>
-              </w:rPr>
             </w:pPr>
             <w:r>
               <w:rPr>
                 <w:rFonts w:ascii="Consolas" w:hAnsi="Consolas"/>
                 <w:sz w:val="18"/>
-                <w:lang w:val="it-IT"/>
               </w:rPr>
               <w:t>Schema Registry / Avro Contract Validation</w:t>
             </w:r>
@@ -15607,7 +15560,6 @@
               <w:rPr>
                 <w:rFonts w:ascii="Consolas" w:hAnsi="Consolas"/>
                 <w:sz w:val="18"/>
-                <w:lang w:val="it-IT"/>
               </w:rPr>
               <w:t xml:space="preserve"> (optional)</w:t>
             </w:r>
@@ -15615,15 +15567,11 @@
           <w:p>
             <w:pPr>
               <w:jc w:val="center"/>
-              <w:rPr>
-                <w:lang w:val="it-IT"/>
-              </w:rPr>
             </w:pPr>
             <w:r>
               <w:rPr>
                 <w:rFonts w:ascii="Consolas" w:hAnsi="Consolas"/>
                 <w:sz w:val="18"/>
-                <w:lang w:val="it-IT"/>
               </w:rPr>
               <w:t xml:space="preserve">        |</w:t>
             </w:r>
@@ -18259,10 +18207,7 @@
         <w:pStyle w:val="Heading1"/>
       </w:pPr>
       <w:r>
-        <w:t>21</w:t>
-      </w:r>
-      <w:r>
-        <w:t>. Delivery Feasibility, Resource and Schedule Risk</w:t>
+        <w:t>21. Delivery Feasibility, Resource and Schedule Risk</w:t>
       </w:r>
     </w:p>
     <w:tbl>
@@ -18309,10 +18254,7 @@
         <w:pStyle w:val="Heading2"/>
       </w:pPr>
       <w:r>
-        <w:t>21</w:t>
-      </w:r>
-      <w:r>
-        <w:t>.1 Current Constraints Requiring Program Attention</w:t>
+        <w:t>21.1 Current Constraints Requiring Program Attention</w:t>
       </w:r>
     </w:p>
     <w:tbl>
@@ -19224,10 +19166,7 @@
         <w:pStyle w:val="Heading2"/>
       </w:pPr>
       <w:r>
-        <w:t>21</w:t>
-      </w:r>
-      <w:r>
-        <w:t>.2 Professional Delivery Assessment</w:t>
+        <w:t>21.2 Professional Delivery Assessment</w:t>
       </w:r>
     </w:p>
     <w:p>
@@ -19245,10 +19184,7 @@
         <w:pStyle w:val="Heading1"/>
       </w:pPr>
       <w:r>
-        <w:t>22</w:t>
-      </w:r>
-      <w:r>
-        <w:t>. Recommended Delivery Plan and Go/No-Go Gates</w:t>
+        <w:t>22. Recommended Delivery Plan and Go/No-Go Gates</w:t>
       </w:r>
     </w:p>
     <w:tbl>
@@ -19817,10 +19753,7 @@
         <w:pStyle w:val="Heading1"/>
       </w:pPr>
       <w:r>
-        <w:t>23</w:t>
-      </w:r>
-      <w:r>
-        <w:t>. Core Business and Functional Requirements</w:t>
+        <w:t>23. Core Business and Functional Requirements</w:t>
       </w:r>
     </w:p>
     <w:tbl>
@@ -21083,10 +21016,7 @@
         <w:pStyle w:val="Heading1"/>
       </w:pPr>
       <w:r>
-        <w:t>24</w:t>
-      </w:r>
-      <w:r>
-        <w:t>. Non-Functional and Control Requirements</w:t>
+        <w:t>24. Non-Functional and Control Requirements</w:t>
       </w:r>
     </w:p>
     <w:tbl>
@@ -22082,10 +22012,7 @@
         <w:pStyle w:val="Heading1"/>
       </w:pPr>
       <w:r>
-        <w:t>25</w:t>
-      </w:r>
-      <w:r>
-        <w:t>. Executive and Operational Reporting</w:t>
+        <w:t>25. Executive and Operational Reporting</w:t>
       </w:r>
     </w:p>
     <w:p>
@@ -22212,7 +22139,7 @@
         </w:trPr>
         <w:tc>
           <w:tcPr>
-            <w:tcW w:w="1296" w:type="dxa"/>
+            <w:tcW w:w="1272" w:type="dxa"/>
             <w:shd w:val="clear" w:color="auto" w:fill="17365D"/>
             <w:tcMar>
               <w:top w:w="60" w:type="dxa"/>
@@ -22235,7 +22162,7 @@
         </w:tc>
         <w:tc>
           <w:tcPr>
-            <w:tcW w:w="9504" w:type="dxa"/>
+            <w:tcW w:w="9112" w:type="dxa"/>
             <w:gridSpan w:val="2"/>
             <w:shd w:val="clear" w:color="auto" w:fill="17365D"/>
             <w:tcMar>
@@ -22265,7 +22192,7 @@
         </w:trPr>
         <w:tc>
           <w:tcPr>
-            <w:tcW w:w="1296" w:type="dxa"/>
+            <w:tcW w:w="1272" w:type="dxa"/>
             <w:tcMar>
               <w:top w:w="60" w:type="dxa"/>
               <w:left w:w="80" w:type="dxa"/>
@@ -22285,7 +22212,7 @@
         </w:tc>
         <w:tc>
           <w:tcPr>
-            <w:tcW w:w="9504" w:type="dxa"/>
+            <w:tcW w:w="9112" w:type="dxa"/>
             <w:gridSpan w:val="2"/>
             <w:tcMar>
               <w:top w:w="60" w:type="dxa"/>
@@ -22312,7 +22239,7 @@
         </w:trPr>
         <w:tc>
           <w:tcPr>
-            <w:tcW w:w="1296" w:type="dxa"/>
+            <w:tcW w:w="1272" w:type="dxa"/>
             <w:shd w:val="clear" w:color="auto" w:fill="F3F6FA"/>
             <w:tcMar>
               <w:top w:w="60" w:type="dxa"/>
@@ -22333,7 +22260,7 @@
         </w:tc>
         <w:tc>
           <w:tcPr>
-            <w:tcW w:w="9504" w:type="dxa"/>
+            <w:tcW w:w="9112" w:type="dxa"/>
             <w:gridSpan w:val="2"/>
             <w:shd w:val="clear" w:color="auto" w:fill="F3F6FA"/>
             <w:tcMar>
@@ -22361,7 +22288,7 @@
         </w:trPr>
         <w:tc>
           <w:tcPr>
-            <w:tcW w:w="1296" w:type="dxa"/>
+            <w:tcW w:w="1272" w:type="dxa"/>
             <w:tcMar>
               <w:top w:w="60" w:type="dxa"/>
               <w:left w:w="80" w:type="dxa"/>
@@ -22381,7 +22308,7 @@
         </w:tc>
         <w:tc>
           <w:tcPr>
-            <w:tcW w:w="9504" w:type="dxa"/>
+            <w:tcW w:w="9112" w:type="dxa"/>
             <w:gridSpan w:val="2"/>
             <w:tcMar>
               <w:top w:w="60" w:type="dxa"/>
@@ -22408,7 +22335,7 @@
         </w:trPr>
         <w:tc>
           <w:tcPr>
-            <w:tcW w:w="1296" w:type="dxa"/>
+            <w:tcW w:w="1272" w:type="dxa"/>
             <w:shd w:val="clear" w:color="auto" w:fill="F3F6FA"/>
             <w:tcMar>
               <w:top w:w="60" w:type="dxa"/>
@@ -22429,7 +22356,7 @@
         </w:tc>
         <w:tc>
           <w:tcPr>
-            <w:tcW w:w="9504" w:type="dxa"/>
+            <w:tcW w:w="9112" w:type="dxa"/>
             <w:gridSpan w:val="2"/>
             <w:shd w:val="clear" w:color="auto" w:fill="F3F6FA"/>
             <w:tcMar>
@@ -22457,7 +22384,7 @@
         </w:trPr>
         <w:tc>
           <w:tcPr>
-            <w:tcW w:w="1296" w:type="dxa"/>
+            <w:tcW w:w="1272" w:type="dxa"/>
             <w:tcMar>
               <w:top w:w="60" w:type="dxa"/>
               <w:left w:w="80" w:type="dxa"/>
@@ -22477,7 +22404,7 @@
         </w:tc>
         <w:tc>
           <w:tcPr>
-            <w:tcW w:w="9504" w:type="dxa"/>
+            <w:tcW w:w="9112" w:type="dxa"/>
             <w:gridSpan w:val="2"/>
             <w:tcMar>
               <w:top w:w="60" w:type="dxa"/>
@@ -22504,7 +22431,7 @@
         </w:trPr>
         <w:tc>
           <w:tcPr>
-            <w:tcW w:w="1296" w:type="dxa"/>
+            <w:tcW w:w="1272" w:type="dxa"/>
             <w:shd w:val="clear" w:color="auto" w:fill="F3F6FA"/>
             <w:tcMar>
               <w:top w:w="60" w:type="dxa"/>
@@ -22525,7 +22452,7 @@
         </w:tc>
         <w:tc>
           <w:tcPr>
-            <w:tcW w:w="9504" w:type="dxa"/>
+            <w:tcW w:w="9112" w:type="dxa"/>
             <w:gridSpan w:val="2"/>
             <w:shd w:val="clear" w:color="auto" w:fill="F3F6FA"/>
             <w:tcMar>
@@ -22553,7 +22480,7 @@
         </w:trPr>
         <w:tc>
           <w:tcPr>
-            <w:tcW w:w="1296" w:type="dxa"/>
+            <w:tcW w:w="1272" w:type="dxa"/>
             <w:tcMar>
               <w:top w:w="60" w:type="dxa"/>
               <w:left w:w="80" w:type="dxa"/>
@@ -22573,7 +22500,7 @@
         </w:tc>
         <w:tc>
           <w:tcPr>
-            <w:tcW w:w="9504" w:type="dxa"/>
+            <w:tcW w:w="9112" w:type="dxa"/>
             <w:gridSpan w:val="2"/>
             <w:tcMar>
               <w:top w:w="60" w:type="dxa"/>
@@ -22600,7 +22527,7 @@
         </w:trPr>
         <w:tc>
           <w:tcPr>
-            <w:tcW w:w="1296" w:type="dxa"/>
+            <w:tcW w:w="1272" w:type="dxa"/>
             <w:shd w:val="clear" w:color="auto" w:fill="F3F6FA"/>
             <w:tcMar>
               <w:top w:w="60" w:type="dxa"/>
@@ -22622,7 +22549,7 @@
         </w:tc>
         <w:tc>
           <w:tcPr>
-            <w:tcW w:w="9504" w:type="dxa"/>
+            <w:tcW w:w="9112" w:type="dxa"/>
             <w:gridSpan w:val="2"/>
             <w:shd w:val="clear" w:color="auto" w:fill="F3F6FA"/>
             <w:tcMar>
@@ -22650,7 +22577,7 @@
         </w:trPr>
         <w:tc>
           <w:tcPr>
-            <w:tcW w:w="1296" w:type="dxa"/>
+            <w:tcW w:w="1272" w:type="dxa"/>
             <w:tcMar>
               <w:top w:w="60" w:type="dxa"/>
               <w:left w:w="80" w:type="dxa"/>
@@ -22670,7 +22597,7 @@
         </w:tc>
         <w:tc>
           <w:tcPr>
-            <w:tcW w:w="9504" w:type="dxa"/>
+            <w:tcW w:w="9112" w:type="dxa"/>
             <w:gridSpan w:val="2"/>
             <w:tcMar>
               <w:top w:w="60" w:type="dxa"/>
@@ -22687,6 +22614,51 @@
               </w:rPr>
               <w:t>What residual schedule and production risk is the sponsor prepared to accept if scope/resources remain unchanged?</w:t>
             </w:r>
+          </w:p>
+        </w:tc>
+      </w:tr>
+      <w:tr>
+        <w:trPr>
+          <w:cantSplit/>
+          <w:jc w:val="center"/>
+        </w:trPr>
+        <w:tc>
+          <w:tcPr>
+            <w:tcW w:w="1272" w:type="dxa"/>
+            <w:tcMar>
+              <w:top w:w="60" w:type="dxa"/>
+              <w:left w:w="80" w:type="dxa"/>
+              <w:bottom w:w="60" w:type="dxa"/>
+              <w:right w:w="80" w:type="dxa"/>
+            </w:tcMar>
+            <w:vAlign w:val="center"/>
+          </w:tcPr>
+          <w:p>
+            <w:pPr>
+              <w:rPr>
+                <w:sz w:val="16"/>
+              </w:rPr>
+            </w:pPr>
+          </w:p>
+        </w:tc>
+        <w:tc>
+          <w:tcPr>
+            <w:tcW w:w="9112" w:type="dxa"/>
+            <w:gridSpan w:val="2"/>
+            <w:tcMar>
+              <w:top w:w="60" w:type="dxa"/>
+              <w:left w:w="80" w:type="dxa"/>
+              <w:bottom w:w="60" w:type="dxa"/>
+              <w:right w:w="80" w:type="dxa"/>
+            </w:tcMar>
+            <w:vAlign w:val="center"/>
+          </w:tcPr>
+          <w:p>
+            <w:pPr>
+              <w:rPr>
+                <w:sz w:val="16"/>
+              </w:rPr>
+            </w:pPr>
           </w:p>
         </w:tc>
       </w:tr>
@@ -22696,12 +22668,12 @@
         </w:tblPrEx>
         <w:trPr>
           <w:gridAfter w:val="1"/>
-          <w:wAfter w:w="30" w:type="dxa"/>
+          <w:wAfter w:w="551" w:type="dxa"/>
           <w:cantSplit/>
         </w:trPr>
         <w:tc>
           <w:tcPr>
-            <w:tcW w:w="10224" w:type="dxa"/>
+            <w:tcW w:w="9833" w:type="dxa"/>
             <w:gridSpan w:val="2"/>
             <w:shd w:val="clear" w:color="auto" w:fill="FFF2CC"/>
             <w:tcMar>
@@ -23778,13 +23750,7 @@
         <w:pStyle w:val="Heading1"/>
       </w:pPr>
       <w:r>
-        <w:t xml:space="preserve">Appendix </w:t>
-      </w:r>
-      <w:r>
-        <w:t>D</w:t>
-      </w:r>
-      <w:r>
-        <w:t xml:space="preserve"> - Key Field Semantics</w:t>
+        <w:t>Appendix D - Key Field Semantics</w:t>
       </w:r>
     </w:p>
     <w:tbl>
@@ -24409,22 +24375,7 @@
         <w:pStyle w:val="Heading1"/>
       </w:pPr>
       <w:r>
-        <w:t xml:space="preserve">Appendix </w:t>
-      </w:r>
-      <w:r>
-        <w:t>E</w:t>
-      </w:r>
-      <w:r>
-        <w:t xml:space="preserve"> </w:t>
-      </w:r>
-      <w:r>
-        <w:t>–</w:t>
-      </w:r>
-      <w:r>
-        <w:t xml:space="preserve"> </w:t>
-      </w:r>
-      <w:r>
-        <w:t>Sample Output</w:t>
+        <w:t>Appendix E – Sample Output</w:t>
       </w:r>
     </w:p>
     <w:p>
@@ -24563,11 +24514,16 @@
     </w:p>
     <w:p/>
     <w:p>
+      <w:pPr>
+        <w:rPr>
+          <w:noProof/>
+        </w:rPr>
+      </w:pPr>
       <w:r>
         <w:rPr>
           <w:noProof/>
         </w:rPr>
-        <w:object w:dxaOrig="1520" w:dyaOrig="960" w14:anchorId="78C71244">
+        <w:object w:dxaOrig="1520" w:dyaOrig="960" w14:anchorId="35EA935D">
           <v:shapetype id="_x0000_t75" coordsize="21600,21600" o:spt="75" o:preferrelative="t" path="m@4@5l@4@11@9@11@9@5xe" filled="f" stroked="f">
             <v:stroke joinstyle="miter"/>
             <v:formulas>
@@ -24587,13 +24543,115 @@
             <v:path o:extrusionok="f" gradientshapeok="t" o:connecttype="rect"/>
             <o:lock v:ext="edit" aspectratio="t"/>
           </v:shapetype>
-          <v:shape id="_x0000_i1025" type="#_x0000_t75" alt="" style="width:75.95pt;height:48.2pt;mso-width-percent:0;mso-height-percent:0;mso-width-percent:0;mso-height-percent:0" o:ole="">
+          <v:shape id="_x0000_i1025" type="#_x0000_t75" alt="" style="width:75.9pt;height:48.3pt;mso-width-percent:0;mso-height-percent:0;mso-width-percent:0;mso-height-percent:0" o:ole="">
             <v:imagedata r:id="rId11" o:title=""/>
           </v:shape>
-          <o:OLEObject Type="Embed" ProgID="Excel.Sheet.12" ShapeID="_x0000_i1025" DrawAspect="Icon" ObjectID="_1848340934" r:id="rId12"/>
+          <o:OLEObject Type="Embed" ProgID="Excel.Sheet.12" ShapeID="_x0000_i1025" DrawAspect="Icon" ObjectID="_1848400042" r:id="rId12"/>
         </w:object>
       </w:r>
     </w:p>
+    <w:p>
+      <w:pPr>
+        <w:pStyle w:val="Heading1"/>
+      </w:pPr>
+      <w:r>
+        <w:t xml:space="preserve">Appendix </w:t>
+      </w:r>
+      <w:r>
+        <w:t>F</w:t>
+      </w:r>
+      <w:r>
+        <w:t xml:space="preserve"> – </w:t>
+      </w:r>
+      <w:r>
+        <w:t>Scoring Chart</w:t>
+      </w:r>
+    </w:p>
+    <w:p>
+      <w:pPr>
+        <w:rPr>
+          <w:noProof/>
+        </w:rPr>
+      </w:pPr>
+    </w:p>
+    <w:p>
+      <w:r>
+        <w:t xml:space="preserve">                    Composite Score</w:t>
+      </w:r>
+    </w:p>
+    <w:p>
+      <w:r>
+        <w:t xml:space="preserve">                          |</w:t>
+      </w:r>
+    </w:p>
+    <w:p>
+      <w:r>
+        <w:t xml:space="preserve">                          v</w:t>
+      </w:r>
+    </w:p>
+    <w:p>
+      <w:r>
+        <w:t xml:space="preserve">               Score &gt;= threshold?</w:t>
+      </w:r>
+    </w:p>
+    <w:p>
+      <w:r>
+        <w:t xml:space="preserve">                    /           \</w:t>
+      </w:r>
+    </w:p>
+    <w:p>
+      <w:r>
+        <w:t xml:space="preserve">                  No             Yes</w:t>
+      </w:r>
+    </w:p>
+    <w:p>
+      <w:r>
+        <w:lastRenderedPageBreak/>
+        <w:t xml:space="preserve">                  |               |</w:t>
+      </w:r>
+    </w:p>
+    <w:p>
+      <w:r>
+        <w:t xml:space="preserve">          HITL_LOW_SCORE          |</w:t>
+      </w:r>
+    </w:p>
+    <w:p>
+      <w:r>
+        <w:t xml:space="preserve">                                  v</w:t>
+      </w:r>
+    </w:p>
+    <w:p>
+      <w:r>
+        <w:t xml:space="preserve">                    Forced-review condition?</w:t>
+      </w:r>
+    </w:p>
+    <w:p>
+      <w:r>
+        <w:t xml:space="preserve">                      /             \</w:t>
+      </w:r>
+    </w:p>
+    <w:p>
+      <w:r>
+        <w:t xml:space="preserve">                    Yes              No</w:t>
+      </w:r>
+    </w:p>
+    <w:p>
+      <w:r>
+        <w:t xml:space="preserve">                     |                |</w:t>
+      </w:r>
+    </w:p>
+    <w:p>
+      <w:r>
+        <w:t xml:space="preserve">                     v                v</w:t>
+      </w:r>
+    </w:p>
+    <w:p>
+      <w:r>
+        <w:t xml:space="preserve">                  HITL           AUTO_ACCEPT</w:t>
+      </w:r>
+    </w:p>
+    <w:p/>
+    <w:p/>
     <w:tbl>
       <w:tblPr>
         <w:tblW w:w="0" w:type="auto"/>

</xml_diff>